<commit_message>
Remove neutral bus line from topology diagram
</commit_message>
<xml_diff>
--- a/three_phase_hw_replacement_plan_simplified.docx
+++ b/three_phase_hw_replacement_plan_simplified.docx
@@ -456,11 +456,13 @@
         <w:pStyle w:val="ListBullet"/>
         <w:spacing w:after="60" w:line="269" w:lineRule="auto"/>
       </w:pPr>
+      <w:r/>
       <w:r>
         <w:rPr>
           <w:rFonts w:ascii="PingFang SC" w:hAnsi="PingFang SC" w:eastAsia="PingFang SC"/>
+          <w:sz w:val="20"/>
         </w:rPr>
-        <w:t>技术路线：本阶段不预设 PLC、嵌入式或混合方案，先冻结功能边界、接口语义和安全要求。</w:t>
+        <w:t>技术路线：本阶段先以嵌入式开发板方案为主要讨论对象，先冻结功能边界、接口语义和安全要求。</w:t>
       </w:r>
     </w:p>
     <w:p>
@@ -888,10 +890,9 @@
             <w:r>
               <w:rPr>
                 <w:rFonts w:ascii="PingFang SC" w:hAnsi="PingFang SC" w:eastAsia="PingFang SC"/>
-                <w:b w:val="0"/>
-                <w:sz w:val="19"/>
+                <w:sz w:val="18"/>
               </w:rPr>
-              <w:t>把评分逻辑和题库答案固化到 PLC 或嵌入式内部</w:t>
+              <w:t>把评分逻辑和题库答案固化到下位机固件内部</w:t>
             </w:r>
           </w:p>
         </w:tc>
@@ -4373,11 +4374,13 @@
         <w:pStyle w:val="ListBullet"/>
         <w:spacing w:after="60" w:line="269" w:lineRule="auto"/>
       </w:pPr>
+      <w:r/>
       <w:r>
         <w:rPr>
           <w:rFonts w:ascii="PingFang SC" w:hAnsi="PingFang SC" w:eastAsia="PingFang SC"/>
+          <w:sz w:val="20"/>
         </w:rPr>
-        <w:t>暂不急于选择 PLC 或嵌入式；先确认 IO 数量、测量能力、刷新周期、安全闭锁和通信语义。</w:t>
+        <w:t>暂不急于确定具体开发板型号；先确认 IO 数量、测量能力、刷新周期、安全闭锁和通信语义。</w:t>
       </w:r>
     </w:p>
     <w:p>
@@ -4385,11 +4388,13 @@
         <w:pStyle w:val="ListBullet"/>
         <w:spacing w:after="60" w:line="269" w:lineRule="auto"/>
       </w:pPr>
+      <w:r/>
       <w:r>
         <w:rPr>
           <w:rFonts w:ascii="PingFang SC" w:hAnsi="PingFang SC" w:eastAsia="PingFang SC"/>
+          <w:sz w:val="20"/>
         </w:rPr>
-        <w:t>上位机先建立统一适配层，避免五步教学服务直接依赖 PLC 地址、Modbus 寄存器或串口字段。</w:t>
+        <w:t>上位机先建立统一适配层，避免五步教学服务直接依赖具体串口字段、寄存器地址或开发板驱动实现。</w:t>
       </w:r>
     </w:p>
     <w:p>
@@ -4420,13 +4425,15 @@
     </w:p>
     <w:p>
       <w:pPr>
-        <w:spacing w:before="0" w:after="120" w:line="283" w:lineRule="auto"/>
+        <w:spacing w:before="0" w:after="100" w:line="269" w:lineRule="auto"/>
       </w:pPr>
+      <w:r/>
       <w:r>
         <w:rPr>
           <w:rFonts w:ascii="PingFang SC" w:hAnsi="PingFang SC" w:eastAsia="PingFang SC"/>
+          <w:sz w:val="21"/>
         </w:rPr>
-        <w:t>进入硬件详细设计前，需要把规划项转化为可画图、可接线、可编码、可验收的输入清单。以下内容建议先冻结，再比较 PLC、嵌入式或混合方案的成本和风险。</w:t>
+        <w:t>进入硬件详细设计前，需要把规划项转化为可画图、可接线、可编码、可验收的输入清单。以下内容建议先冻结，再比较不同嵌入式开发板、测量模块和通信方案的成本和风险。</w:t>
       </w:r>
     </w:p>
     <w:tbl>
@@ -4600,10 +4607,9 @@
             <w:r>
               <w:rPr>
                 <w:rFonts w:ascii="PingFang SC" w:hAnsi="PingFang SC" w:eastAsia="PingFang SC"/>
-                <w:b w:val="0"/>
-                <w:sz w:val="19"/>
+                <w:sz w:val="18"/>
               </w:rPr>
-              <w:t>PLC/嵌入式 IO 清单</w:t>
+              <w:t>嵌入式 IO 清单</w:t>
             </w:r>
           </w:p>
         </w:tc>
@@ -5105,13 +5111,15 @@
     </w:p>
     <w:p>
       <w:pPr>
-        <w:spacing w:before="0" w:after="40" w:line="283" w:lineRule="auto"/>
+        <w:spacing w:before="0" w:after="100" w:line="269" w:lineRule="auto"/>
       </w:pPr>
+      <w:r/>
       <w:r>
         <w:rPr>
           <w:rFonts w:ascii="PingFang SC" w:hAnsi="PingFang SC" w:eastAsia="PingFang SC"/>
+          <w:sz w:val="21"/>
         </w:rPr>
-        <w:t>本项目下一阶段的关键，不是立即决定 PLC 或嵌入式，而是先冻结软硬边界、低压安全原则、硬件替代层级、统一通信语义和 V1/V2 的近期落地范围。只要这些输入稳定，后续无论选择 PLC、嵌入式还是混合方案，都可以复用现有上位机教学系统，并逐步把虚拟操作替换成真实硬件实训。</w:t>
+        <w:t>本项目下一阶段的关键，不是立即决定具体开发板型号，而是先冻结软硬边界、低压安全原则、硬件替代层级、统一通信语义和 V1/V2 的近期落地范围。只要这些输入稳定，后续围绕嵌入式开发板、测量模块和通信接口逐步细化，就可以复用现有上位机教学系统，并逐步把虚拟操作替换成真实硬件实训。</w:t>
       </w:r>
     </w:p>
     <w:sectPr>

</xml_diff>